<commit_message>
Prueba de Commit en la version 2022
</commit_message>
<xml_diff>
--- a/leeme.docx
+++ b/leeme.docx
@@ -4,12 +4,44 @@
   <w:body>
     <w:p>
       <w:r>
-        <w:t>No se puede importar el archivo de clave siguiente: EDExplorer_TemporaryKey.pfx. Puede que esté protegido mediante contraseña. Para solucionar este problema, intente importar de nuevo el certificado o instale manualmente el certificado en el CSP de nombres seguros con el nombre de contenedor de clave siguiente: VS_KEY_19F9020A7A195FAD</w:t>
+        <w:t xml:space="preserve">No se puede importar el archivo de clave siguiente: </w:t>
+      </w:r>
+      <w:proofErr w:type="spellStart"/>
+      <w:r>
+        <w:t>EDExplorer_TemporaryKey.pfx</w:t>
+      </w:r>
+      <w:proofErr w:type="spellEnd"/>
+      <w:r>
+        <w:t>. Puede que esté protegido mediante contraseña. Para solucionar este problema, intente importar de nuevo el certificado o instale manualmente el certificado en el CSP de nombres seguros con el nombre de contenedor de clave siguiente: VS_KEY_19F9020A7A195FAD</w:t>
       </w:r>
     </w:p>
     <w:p>
       <w:r>
-        <w:t>C:\Program Files (x86)\Microsoft SDKs\Windows\v10.0A\bin\NETFX 4.8 Tools</w:t>
+        <w:t>C:\Program Files (x</w:t>
+      </w:r>
+      <w:proofErr w:type="gramStart"/>
+      <w:r>
+        <w:t>86)\</w:t>
+      </w:r>
+      <w:proofErr w:type="gramEnd"/>
+      <w:r>
+        <w:t xml:space="preserve">Microsoft </w:t>
+      </w:r>
+      <w:proofErr w:type="spellStart"/>
+      <w:r>
+        <w:t>SDKs</w:t>
+      </w:r>
+      <w:proofErr w:type="spellEnd"/>
+      <w:r>
+        <w:t>\Windows\v10.0A\</w:t>
+      </w:r>
+      <w:proofErr w:type="spellStart"/>
+      <w:r>
+        <w:t>bin</w:t>
+      </w:r>
+      <w:proofErr w:type="spellEnd"/>
+      <w:r>
+        <w:t>\NETFX 4.8 Tools</w:t>
       </w:r>
     </w:p>
     <w:p>
@@ -18,10 +50,16 @@
       </w:r>
     </w:p>
     <w:p>
+      <w:proofErr w:type="spellStart"/>
       <w:r>
-        <w:t>Pwd: golfo99</w:t>
+        <w:t>Pwd</w:t>
+      </w:r>
+      <w:proofErr w:type="spellEnd"/>
+      <w:r>
+        <w:t>: golfo99</w:t>
       </w:r>
     </w:p>
+    <w:p/>
     <w:sectPr>
       <w:pgSz w:w="11906" w:h="16838"/>
       <w:pgMar w:top="1417" w:right="1701" w:bottom="1417" w:left="1701" w:header="708" w:footer="708" w:gutter="0"/>

</xml_diff>